<commit_message>
Corrige el informe de verificación al español
Traduce las descripciones de las pruebas automatizadas, ajusta el texto técnico y conserva los comandos, identificadores y referencias necesarios para reproducir la campaña.
</commit_message>
<xml_diff>
--- a/entregables/evaluacion_profesor/Informe_Verificacion_Localito.docx
+++ b/entregables/evaluacion_profesor/Informe_Verificacion_Localito.docx
@@ -27,7 +27,7 @@
         <w:pStyle w:val="Subtitle"/>
       </w:pPr>
       <w:r>
-        <w:t>Proyecto Capstone de Ingeniería en Informática</w:t>
+        <w:t xml:space="preserve">Proyecto de título de Ingeniería en Informática</w:t>
       </w:r>
     </w:p>
     <w:p>
@@ -35,7 +35,7 @@
         <w:pStyle w:val="Subtitle"/>
       </w:pPr>
       <w:r>
-        <w:t>Localito PWA SaaS para gestión de pequeños comercios</w:t>
+        <w:t xml:space="preserve">Localito aplicación web progresiva como servicio para pequeños comercios</w:t>
       </w:r>
     </w:p>
     <w:p>
@@ -75,7 +75,7 @@
         <w:spacing w:before="400"/>
       </w:pPr>
       <w:r>
-        <w:t>Este documento desarrolla informe de verificación con evidencia del repositorio y referencias públicas. Distingue implementación, resultados históricos y mejoras pendientes.</w:t>
+        <w:t xml:space="preserve">Este informe presenta la verificación técnica de Localito con evidencia del repositorio y referencias públicas. Distingue implementación, resultados históricos y mejoras pendientes.</w:t>
       </w:r>
     </w:p>
     <w:p>
@@ -140,7 +140,7 @@
           <w:rPr>
             <w:color w:val="000000"/>
           </w:rPr>
-          <w:t xml:space="preserve">2 Objetivo  alcance y ambiente</w:t>
+          <w:t xml:space="preserve">2 Objetivo alcance y ambiente</w:t>
         </w:r>
       </w:hyperlink>
       <w:r>
@@ -357,7 +357,7 @@
           <w:rPr>
             <w:color w:val="000000"/>
           </w:rPr>
-          <w:t xml:space="preserve">9 Evidencias  integridad y custodia</w:t>
+          <w:t xml:space="preserve">9 Evidencias integridad y custodia</w:t>
         </w:r>
       </w:hyperlink>
       <w:r>
@@ -492,32 +492,32 @@
     </w:p>
     <w:p>
       <w:r>
-        <w:t xml:space="preserve">La campaña del 04 de octubre de 2026 completó satisfactoriamente el análisis de tipos, la compilación, 78 pruebas automatizadas y 12 casos HTTP de integración local. Los resultados pertenecen al commit </w:t>
+        <w:t xml:space="preserve">La campaña del 04 de octubre de 2026 completó satisfactoriamente el análisis de tipos, la compilación, 78 pruebas automatizadas y 12 casos HTTP de integración local. Los resultados pertenecen a la revisión ddb9956cf35cfb2035f62528299fd6bb2c9b7d5c. Se trabajó con código descargado del repositorio y datos sintéticos; los archivos recuperados fueron verificados contra los identificadores de sus objetos de contenido en Git.</w:t>
       </w:r>
       <w:r>
         <w:rPr>
           <w:rFonts w:ascii="DejaVu Sans Mono" w:hAnsi="DejaVu Sans Mono"/>
           <w:sz w:val="18"/>
         </w:rPr>
-        <w:t>ddb9956cf35cfb2035f62528299fd6bb2c9b7d5c</w:t>
+        <w:t xml:space="preserve"/>
       </w:r>
       <w:r>
-        <w:t>. Se trabajó con código descargado del repositorio y datos sintéticos; los archivos recuperados fueron verificados contra sus identificadores de blob de Git.</w:t>
+        <w:t xml:space="preserve"/>
       </w:r>
     </w:p>
     <w:p>
       <w:r>
-        <w:t xml:space="preserve">El comando agregado </w:t>
+        <w:t xml:space="preserve">El comando agregado npm run check no terminó correctamente: después del análisis de tipos, el lanzador tsx intentó crear un canal IPC y recibió EPERM. La campaña se completó utilizando el ejecutor de pruebas de Node con tsx como importador y sin aislamiento entre archivos. La compilación se ejecutó por separado. Por tanto, se informan componentes aprobados, sin presentar el comando original como exitoso.</w:t>
       </w:r>
       <w:r>
         <w:rPr>
           <w:rFonts w:ascii="DejaVu Sans Mono" w:hAnsi="DejaVu Sans Mono"/>
           <w:sz w:val="18"/>
         </w:rPr>
-        <w:t>npm run check</w:t>
+        <w:t xml:space="preserve"/>
       </w:r>
       <w:r>
-        <w:t xml:space="preserve"> no terminó correctamente: después del análisis de tipos, el lanzador tsx intentó crear un canal IPC y recibió EPERM. La campaña se completó ejecutando el runner de Node con tsx como importador y sin aislamiento entre archivos. La compilación se ejecutó por separado. Por tanto, se informan componentes aprobados, sin presentar el comando original como exitoso.</w:t>
+        <w:t xml:space="preserve"/>
       </w:r>
     </w:p>
     <w:p>
@@ -531,43 +531,43 @@
       </w:pPr>
       <w:bookmarkStart w:id="2" w:name="h2"/>
       <w:r>
-        <w:t>2 Objetivo  alcance y ambiente</w:t>
+        <w:t xml:space="preserve">2 Objetivo alcance y ambiente</w:t>
       </w:r>
       <w:bookmarkEnd w:id="2"/>
     </w:p>
     <w:p>
       <w:r>
-        <w:t xml:space="preserve">Se verificaron reglas de negocio, validaciones, separación de negocios, permisos y comportamiento HTTP. El runtime fue Node.js 24.19.0 y npm 11.9.0. La instalación utilizó el lockfile con </w:t>
+        <w:t xml:space="preserve">Se verificaron reglas de negocio, validaciones, separación de negocios, permisos y comportamiento HTTP. Se utilizó Node.js 24.19.0 como entorno de ejecución y npm 11.9.0 como gestor de paquetes. La instalación utilizó el archivo de versiones de dependencias con npm ci --include=dev --ignore-scripts --no-audit --no-fund. Se instalaron 147 paquetes. Omitir las secuencias de instalación fue una decisión del ambiente; debe declararse al repetir la campaña. No se ejecutó una auditoría de dependencias con ese comando.</w:t>
       </w:r>
       <w:r>
         <w:rPr>
           <w:rFonts w:ascii="DejaVu Sans Mono" w:hAnsi="DejaVu Sans Mono"/>
           <w:sz w:val="18"/>
         </w:rPr>
-        <w:t>npm ci --include=dev --ignore-scripts --no-audit --no-fund</w:t>
+        <w:t xml:space="preserve"/>
       </w:r>
       <w:r>
-        <w:t>. Se instalaron 147 paquetes. Omitir scripts de instalación fue una decisión del ambiente; debe declararse al repetir la campaña. No se ejecutó una auditoría de dependencias con ese comando.</w:t>
+        <w:t xml:space="preserve"/>
       </w:r>
     </w:p>
     <w:p>
       <w:r>
-        <w:t xml:space="preserve">La API de integración escuchó únicamente en </w:t>
+        <w:t xml:space="preserve">La API de integración escuchó únicamente en 127.0.0.1:43201, con la implementación de almacenamiento en memoria MemoryRepository y negocios sintéticos. Se eliminó el proceso al finalizar. El conjunto de pruebas combina repositorio en memoria, respuestas controladas de servicios externos, un grupo simulado de conexiones a PostgreSQL y verificaciones de estilos y almacenamiento local. Ninguno de esos dobles sustituye una base PostgreSQL ni una medición de IA con imágenes reales.</w:t>
       </w:r>
       <w:r>
         <w:rPr>
           <w:rFonts w:ascii="DejaVu Sans Mono" w:hAnsi="DejaVu Sans Mono"/>
           <w:sz w:val="18"/>
         </w:rPr>
-        <w:t>127.0.0.1:43201</w:t>
+        <w:t xml:space="preserve"/>
       </w:r>
       <w:r>
-        <w:t>, con almacenamiento MemoryRepository y negocios sintéticos. Se eliminó el proceso al finalizar. La suite combina repositorio en memoria, respuestas controladas de servicios externos, un pool PostgreSQL simulado y verificaciones de estilos y almacenamiento local. Ninguno de esos dobles sustituye una base PostgreSQL ni una medición de IA con imágenes reales.</w:t>
+        <w:t xml:space="preserve"/>
       </w:r>
     </w:p>
     <w:p>
       <w:r>
-        <w:t>El workflow del repositorio utiliza Node 22. La ejecución local con Node 24 no reemplaza ese control de integración continua. Se debe conservar el resultado de CI sobre la revisión que se entregue.</w:t>
+        <w:t xml:space="preserve">El flujo automatizado del repositorio utiliza Node 22. La ejecución local con Node 24 no reemplaza ese control de integración continua. Se debe conservar el resultado de integración continua sobre la revisión que se entregue.</w:t>
       </w:r>
     </w:p>
     <w:p>
@@ -737,7 +737,7 @@
                 <w:color w:val="000000"/>
                 <w:sz w:val="19"/>
               </w:rPr>
-              <w:t>Completada; scripts de instalación omitidos</w:t>
+              <w:t xml:space="preserve">Completada; secuencias de instalación omitidas</w:t>
             </w:r>
           </w:p>
         </w:tc>
@@ -922,7 +922,7 @@
                 <w:color w:val="000000"/>
                 <w:sz w:val="19"/>
               </w:rPr>
-              <w:t>Runner alternativo</w:t>
+              <w:t xml:space="preserve">Ejecutor alternativo</w:t>
             </w:r>
           </w:p>
         </w:tc>
@@ -1011,7 +1011,7 @@
                 <w:color w:val="000000"/>
                 <w:sz w:val="19"/>
               </w:rPr>
-              <w:t>Shared, API y web aprobados; salida 0</w:t>
+              <w:t xml:space="preserve">Componentes compartidos, API y aplicación web aprobados; salida 0</w:t>
             </w:r>
           </w:p>
         </w:tc>
@@ -1328,7 +1328,7 @@
     </w:p>
     <w:p>
       <w:r>
-        <w:t>Se conservan los nombres originales del runner para permitir búsqueda literal en la evidencia. Todos los casos de esta tabla figuran aprobados. AUT45 contiene además los 21 subcasos contabilizados por Node.</w:t>
+        <w:t xml:space="preserve">Las descripciones se presentan en español. Los identificadores AUT mantienen el orden de los casos del registro de pruebas y permiten relacionar cada descripción con su evidencia. Todos los casos de esta tabla figuran aprobados. AUT45 incluye además los 21 subcasos contabilizados por Node.</w:t>
       </w:r>
     </w:p>
     <w:tbl>
@@ -1399,7 +1399,7 @@
                 <w:color w:val="FFFFFF"/>
                 <w:sz w:val="19"/>
               </w:rPr>
-              <w:t>Nombre literal en el registro</w:t>
+              <w:t xml:space="preserve">Descripción de la prueba</w:t>
             </w:r>
           </w:p>
         </w:tc>
@@ -1446,7 +1446,7 @@
                 <w:color w:val="000000"/>
                 <w:sz w:val="19"/>
               </w:rPr>
-              <w:t>expected domain errors do not leak as internal server failures</w:t>
+              <w:t xml:space="preserve">Los errores de dominio previstos no se presentan como fallos internos del servidor</w:t>
             </w:r>
           </w:p>
         </w:tc>
@@ -1493,7 +1493,7 @@
                 <w:color w:val="000000"/>
                 <w:sz w:val="19"/>
               </w:rPr>
-              <w:t>production and Vercel require persistent storage</w:t>
+              <w:t xml:space="preserve">El entorno de producción y Vercel requieren almacenamiento persistente</w:t>
             </w:r>
           </w:p>
         </w:tc>
@@ -1540,7 +1540,7 @@
                 <w:color w:val="000000"/>
                 <w:sz w:val="19"/>
               </w:rPr>
-              <w:t>database URL resolution ignores blank values and supports Vercel aliases</w:t>
+              <w:t xml:space="preserve">La resolución de la dirección de la base de datos omite valores vacíos y admite los alias de Vercel</w:t>
             </w:r>
           </w:p>
         </w:tc>
@@ -1587,7 +1587,7 @@
                 <w:color w:val="000000"/>
                 <w:sz w:val="19"/>
               </w:rPr>
-              <w:t>PostgreSQL returns and cancellations reuse the held Vercel connection</w:t>
+              <w:t xml:space="preserve">Las devoluciones y anulaciones en PostgreSQL reutilizan la conexión reservada de Vercel</w:t>
             </w:r>
           </w:p>
         </w:tc>
@@ -1634,7 +1634,7 @@
                 <w:color w:val="000000"/>
                 <w:sz w:val="19"/>
               </w:rPr>
-              <w:t>vision provider prefers Groq and supports an explicit OpenAI fallback</w:t>
+              <w:t xml:space="preserve">El proveedor de análisis visual prioriza Groq y admite OpenAI como alternativa configurada explícitamente</w:t>
             </w:r>
           </w:p>
         </w:tc>
@@ -1681,7 +1681,7 @@
                 <w:color w:val="000000"/>
                 <w:sz w:val="19"/>
               </w:rPr>
-              <w:t>vision provider explains the free quota retry time</w:t>
+              <w:t xml:space="preserve">El proveedor de análisis visual informa el tiempo de espera para reintentar tras agotar la cuota gratuita</w:t>
             </w:r>
           </w:p>
         </w:tc>
@@ -1728,7 +1728,7 @@
                 <w:color w:val="000000"/>
                 <w:sz w:val="19"/>
               </w:rPr>
-              <w:t>vision provider distinguishes its payload limit from a browser upload limit</w:t>
+              <w:t xml:space="preserve">El proveedor de análisis visual distingue su límite de datos del límite de carga del navegador</w:t>
             </w:r>
           </w:p>
         </w:tc>
@@ -1775,7 +1775,7 @@
                 <w:color w:val="000000"/>
                 <w:sz w:val="19"/>
               </w:rPr>
-              <w:t>PostgreSQL demo seeds use stable UUIDs</w:t>
+              <w:t xml:space="preserve">Los datos iniciales de demostración de PostgreSQL utilizan identificadores UUID estables</w:t>
             </w:r>
           </w:p>
         </w:tc>
@@ -1822,7 +1822,7 @@
                 <w:color w:val="000000"/>
                 <w:sz w:val="19"/>
               </w:rPr>
-              <w:t>passwords and sessions use non-predictable hashes</w:t>
+              <w:t xml:space="preserve">Las contraseñas y sesiones utilizan valores criptográficos no predecibles</w:t>
             </w:r>
           </w:p>
         </w:tc>
@@ -1869,7 +1869,7 @@
                 <w:color w:val="000000"/>
                 <w:sz w:val="19"/>
               </w:rPr>
-              <w:t>transactional email selects only a fully configured provider</w:t>
+              <w:t xml:space="preserve">El correo transaccional selecciona únicamente un proveedor completamente configurado</w:t>
             </w:r>
           </w:p>
         </w:tc>
@@ -1916,7 +1916,7 @@
                 <w:color w:val="000000"/>
                 <w:sz w:val="19"/>
               </w:rPr>
-              <w:t>tenant registration is isolated and rejects duplicate emails</w:t>
+              <w:t xml:space="preserve">El registro de negocios mantiene el aislamiento y rechaza correos electrónicos duplicados</w:t>
             </w:r>
           </w:p>
         </w:tc>
@@ -1963,7 +1963,7 @@
                 <w:color w:val="000000"/>
                 <w:sz w:val="19"/>
               </w:rPr>
-              <w:t>new tenants receive a 30-day Pro trial with centralized entitlements</w:t>
+              <w:t xml:space="preserve">Los nuevos negocios reciben una prueba de 30 días del plan Pro con permisos centralizados</w:t>
             </w:r>
           </w:p>
         </w:tc>
@@ -2010,7 +2010,7 @@
                 <w:color w:val="000000"/>
                 <w:sz w:val="19"/>
               </w:rPr>
-              <w:t>plan changes gate Pro features and expired subscriptions become read-only</w:t>
+              <w:t xml:space="preserve">Los cambios de plan regulan las funciones Pro y las suscripciones vencidas quedan en modo de solo lectura</w:t>
             </w:r>
           </w:p>
         </w:tc>
@@ -2057,7 +2057,7 @@
                 <w:color w:val="000000"/>
                 <w:sz w:val="19"/>
               </w:rPr>
-              <w:t>manual subscription requests never activate themselves and preserve data access</w:t>
+              <w:t xml:space="preserve">Las solicitudes manuales de suscripción no se activan automáticamente y conservan el acceso a los datos</w:t>
             </w:r>
           </w:p>
         </w:tc>
@@ -2104,7 +2104,7 @@
                 <w:color w:val="000000"/>
                 <w:sz w:val="19"/>
               </w:rPr>
-              <w:t>owners can update business identity without changing tenant activation</w:t>
+              <w:t xml:space="preserve">Los propietarios pueden actualizar la identidad del comercio sin modificar la activación del negocio</w:t>
             </w:r>
           </w:p>
         </w:tc>
@@ -2151,7 +2151,7 @@
                 <w:color w:val="000000"/>
                 <w:sz w:val="19"/>
               </w:rPr>
-              <w:t>initial inventory bulk import validates rows, avoids duplicates and is safe to retry</w:t>
+              <w:t xml:space="preserve">La importación masiva del inventario inicial valida filas, evita duplicados y permite reintentos seguros</w:t>
             </w:r>
           </w:p>
         </w:tc>
@@ -2198,7 +2198,7 @@
                 <w:color w:val="000000"/>
                 <w:sz w:val="19"/>
               </w:rPr>
-              <w:t>password recovery is single-use, changes the password and revokes sessions</w:t>
+              <w:t xml:space="preserve">La recuperación de contraseña es de un solo uso, cambia la clave y revoca las sesiones</w:t>
             </w:r>
           </w:p>
         </w:tc>
@@ -2245,7 +2245,7 @@
                 <w:color w:val="000000"/>
                 <w:sz w:val="19"/>
               </w:rPr>
-              <w:t>system admin manages tenants and their users without entering store operations</w:t>
+              <w:t xml:space="preserve">El administrador del sistema gestiona negocios y usuarios sin acceder a las operaciones del comercio</w:t>
             </w:r>
           </w:p>
         </w:tc>
@@ -2292,7 +2292,7 @@
                 <w:color w:val="000000"/>
                 <w:sz w:val="19"/>
               </w:rPr>
-              <w:t>critical business flows are consistent and idempotent</w:t>
+              <w:t xml:space="preserve">Los procesos críticos del negocio son coherentes e idempotentes</w:t>
             </w:r>
           </w:p>
         </w:tc>
@@ -2339,7 +2339,7 @@
                 <w:color w:val="000000"/>
                 <w:sz w:val="19"/>
               </w:rPr>
-              <w:t>closing the cash register resets the dashboard period without losing its history</w:t>
+              <w:t xml:space="preserve">El cierre de caja reinicia el período del panel de control sin perder el historial</w:t>
             </w:r>
           </w:p>
         </w:tc>
@@ -2386,7 +2386,7 @@
                 <w:color w:val="000000"/>
                 <w:sz w:val="19"/>
               </w:rPr>
-              <w:t>invoice vision output is normalized and only matches products from the tenant catalog</w:t>
+              <w:t xml:space="preserve">El resultado del análisis visual de facturas se normaliza y solo relaciona productos del catálogo del negocio</w:t>
             </w:r>
           </w:p>
         </w:tc>
@@ -2433,7 +2433,7 @@
                 <w:color w:val="000000"/>
                 <w:sz w:val="19"/>
               </w:rPr>
-              <w:t>invoice vision request uses a strict schema and disables provider storage</w:t>
+              <w:t xml:space="preserve">La solicitud de análisis visual de facturas utiliza un esquema estricto y desactiva el almacenamiento del proveedor</w:t>
             </w:r>
           </w:p>
         </w:tc>
@@ -2480,7 +2480,7 @@
                 <w:color w:val="000000"/>
                 <w:sz w:val="19"/>
               </w:rPr>
-              <w:t>quick sale normalizes multiple products, groups quantities and never trusts unknown catalog ids</w:t>
+              <w:t xml:space="preserve">La venta rápida normaliza varios productos, agrupa cantidades y rechaza identificadores ajenos al catálogo</w:t>
             </w:r>
           </w:p>
         </w:tc>
@@ -2527,7 +2527,7 @@
                 <w:color w:val="000000"/>
                 <w:sz w:val="19"/>
               </w:rPr>
-              <w:t>quick sale vision uses strict structured output, catalog context and provider privacy controls</w:t>
+              <w:t xml:space="preserve">El análisis visual de venta rápida utiliza respuestas estructuradas estrictas, contexto del catálogo y controles de privacidad</w:t>
             </w:r>
           </w:p>
         </w:tc>
@@ -2574,7 +2574,7 @@
                 <w:color w:val="000000"/>
                 <w:sz w:val="19"/>
               </w:rPr>
-              <w:t>quick sale uses Groq vision JSON mode without sending prices or stock</w:t>
+              <w:t xml:space="preserve">La venta rápida utiliza el modo JSON del análisis visual de Groq sin enviar precios ni existencias</w:t>
             </w:r>
           </w:p>
         </w:tc>
@@ -2621,7 +2621,7 @@
                 <w:color w:val="000000"/>
                 <w:sz w:val="19"/>
               </w:rPr>
-              <w:t>quick sale reads a product created immediately before the analysis from the current tenant catalog</w:t>
+              <w:t xml:space="preserve">La venta rápida consulta en el catálogo del negocio un producto creado inmediatamente antes del análisis</w:t>
             </w:r>
           </w:p>
         </w:tc>
@@ -2668,7 +2668,7 @@
                 <w:color w:val="000000"/>
                 <w:sz w:val="19"/>
               </w:rPr>
-              <w:t>quick sale adds reviewed quantities to the existing POS ticket without changing inventory</w:t>
+              <w:t xml:space="preserve">La venta rápida agrega cantidades revisadas a la venta en curso del punto de venta sin modificar el inventario</w:t>
             </w:r>
           </w:p>
         </w:tc>
@@ -2715,7 +2715,7 @@
                 <w:color w:val="000000"/>
                 <w:sz w:val="19"/>
               </w:rPr>
-              <w:t>invoice import validates review fields, receives stock once and blocks duplicate invoices</w:t>
+              <w:t xml:space="preserve">La importación de facturas valida los campos revisados, ingresa existencias una sola vez y bloquea facturas duplicadas</w:t>
             </w:r>
           </w:p>
         </w:tc>
@@ -2762,7 +2762,7 @@
                 <w:color w:val="000000"/>
                 <w:sz w:val="19"/>
               </w:rPr>
-              <w:t>invoice import rejects unsafe quantities and unconfirmed sale prices before writing</w:t>
+              <w:t xml:space="preserve">La importación de facturas rechaza cantidades inseguras y precios de venta sin confirmar antes de guardar</w:t>
             </w:r>
           </w:p>
         </w:tc>
@@ -2809,7 +2809,7 @@
                 <w:color w:val="000000"/>
                 <w:sz w:val="19"/>
               </w:rPr>
-              <w:t>administration can reset credentials and permanently delete users without deleting sale history</w:t>
+              <w:t xml:space="preserve">La administración restablece credenciales y elimina usuarios permanentemente sin borrar el historial de ventas</w:t>
             </w:r>
           </w:p>
         </w:tc>
@@ -2856,7 +2856,7 @@
                 <w:color w:val="000000"/>
                 <w:sz w:val="19"/>
               </w:rPr>
-              <w:t>platform deletion removes a tenant and all its operational data</w:t>
+              <w:t xml:space="preserve">La eliminación desde la plataforma retira un negocio y todos sus datos operativos</w:t>
             </w:r>
           </w:p>
         </w:tc>
@@ -2903,7 +2903,7 @@
                 <w:color w:val="000000"/>
                 <w:sz w:val="19"/>
               </w:rPr>
-              <w:t>inventory alerts and destination filters share stock rules</w:t>
+              <w:t xml:space="preserve">Las alertas de inventario y los filtros de destino comparten las reglas de existencias</w:t>
             </w:r>
           </w:p>
         </w:tc>
@@ -2950,7 +2950,7 @@
                 <w:color w:val="000000"/>
                 <w:sz w:val="19"/>
               </w:rPr>
-              <w:t>expiry uses inclusive 30 calendar days and excludes empty stock</w:t>
+              <w:t xml:space="preserve">El cálculo de vencimiento incluye 30 días calendario y excluye productos sin existencias</w:t>
             </w:r>
           </w:p>
         </w:tc>
@@ -2997,7 +2997,7 @@
                 <w:color w:val="000000"/>
                 <w:sz w:val="19"/>
               </w:rPr>
-              <w:t>business day stays in Chile across UTC midnight</w:t>
+              <w:t xml:space="preserve">La fecha comercial se mantiene en la zona horaria de Chile al pasar la medianoche UTC</w:t>
             </w:r>
           </w:p>
         </w:tc>
@@ -3044,7 +3044,7 @@
                 <w:color w:val="000000"/>
                 <w:sz w:val="19"/>
               </w:rPr>
-              <w:t>overdue excludes paid, cancelled, zero balances and debts due today</w:t>
+              <w:t xml:space="preserve">Las deudas vencidas excluyen las pagadas, anuladas, con saldo cero y las que vencen hoy</w:t>
             </w:r>
           </w:p>
         </w:tc>
@@ -3091,7 +3091,7 @@
                 <w:color w:val="000000"/>
                 <w:sz w:val="19"/>
               </w:rPr>
-              <w:t>recent sales are sorted without mutation and omit cancelled sales</w:t>
+              <w:t xml:space="preserve">Las ventas recientes se ordenan sin modificar los datos originales y excluyen las anuladas</w:t>
             </w:r>
           </w:p>
         </w:tc>
@@ -3138,7 +3138,7 @@
                 <w:color w:val="000000"/>
                 <w:sz w:val="19"/>
               </w:rPr>
-              <w:t>light theme keeps body, action and selected-payment text at 4.5:1 contrast</w:t>
+              <w:t xml:space="preserve">El tema claro mantiene una relación de contraste de 4,5:1 en el texto general, las acciones y el pago seleccionado</w:t>
             </w:r>
           </w:p>
         </w:tc>
@@ -3185,7 +3185,7 @@
                 <w:color w:val="000000"/>
                 <w:sz w:val="19"/>
               </w:rPr>
-              <w:t>dark theme keeps body, action and selected-payment text at 4.5:1 contrast</w:t>
+              <w:t xml:space="preserve">El tema oscuro mantiene una relación de contraste de 4,5:1 en el texto general, las acciones y el pago seleccionado</w:t>
             </w:r>
           </w:p>
         </w:tc>
@@ -3232,7 +3232,7 @@
                 <w:color w:val="000000"/>
                 <w:sz w:val="19"/>
               </w:rPr>
-              <w:t>selected payment uses the tested foreground and a visible check</w:t>
+              <w:t xml:space="preserve">El pago seleccionado utiliza el color de texto comprobado y una marca de selección visible</w:t>
             </w:r>
           </w:p>
         </w:tc>
@@ -3279,7 +3279,7 @@
                 <w:color w:val="000000"/>
                 <w:sz w:val="19"/>
               </w:rPr>
-              <w:t>shared typography has no viewport font scaling or heavy display weights</w:t>
+              <w:t xml:space="preserve">La tipografía compartida evita escalarse según el tamaño de pantalla y usar grosores excesivos en los títulos</w:t>
             </w:r>
           </w:p>
         </w:tc>
@@ -3326,7 +3326,7 @@
                 <w:color w:val="000000"/>
                 <w:sz w:val="19"/>
               </w:rPr>
-              <w:t>cash tabs keep a single four-column row and inactive panels stay hidden</w:t>
+              <w:t xml:space="preserve">Las pestañas de caja mantienen una fila de cuatro columnas y los paneles inactivos permanecen ocultos</w:t>
             </w:r>
           </w:p>
         </w:tc>
@@ -3373,7 +3373,7 @@
                 <w:color w:val="000000"/>
                 <w:sz w:val="19"/>
               </w:rPr>
-              <w:t>recent sale rows and expanded details have distinct themed surfaces</w:t>
+              <w:t xml:space="preserve">Las filas de ventas recientes y sus detalles desplegados utilizan fondos diferenciados según el tema</w:t>
             </w:r>
           </w:p>
         </w:tc>
@@ -3420,7 +3420,7 @@
                 <w:color w:val="000000"/>
                 <w:sz w:val="19"/>
               </w:rPr>
-              <w:t>sale search dialog has an opaque theme surface above its backdrop</w:t>
+              <w:t xml:space="preserve">El cuadro de búsqueda de ventas utiliza un fondo opaco según el tema, por encima de la capa de fondo</w:t>
             </w:r>
           </w:p>
         </w:tc>
@@ -3467,7 +3467,7 @@
                 <w:color w:val="000000"/>
                 <w:sz w:val="19"/>
               </w:rPr>
-              <w:t>sale action dialog has an opaque themed surface</w:t>
+              <w:t xml:space="preserve">El cuadro de acciones de venta utiliza un fondo opaco acorde con el tema</w:t>
             </w:r>
           </w:p>
         </w:tc>
@@ -3514,7 +3514,7 @@
                 <w:color w:val="000000"/>
                 <w:sz w:val="19"/>
               </w:rPr>
-              <w:t>invalid sale payloads never alter stock, debt or sales</w:t>
+              <w:t xml:space="preserve">Los datos de ventas inválidas nunca alteran las existencias, las deudas ni las ventas</w:t>
             </w:r>
           </w:p>
         </w:tc>
@@ -3561,7 +3561,7 @@
                 <w:color w:val="000000"/>
                 <w:sz w:val="19"/>
               </w:rPr>
-              <w:t>audit pagination spans more than 100 entries without duplicates; cursor and search are tenant scoped</w:t>
+              <w:t xml:space="preserve">La paginación de auditoría recorre más de 100 registros sin duplicados; el cursor y la búsqueda se limitan al negocio</w:t>
             </w:r>
           </w:p>
         </w:tc>
@@ -3608,7 +3608,7 @@
                 <w:color w:val="000000"/>
                 <w:sz w:val="19"/>
               </w:rPr>
-              <w:t>offline rejection isolation, transient stops, account isolation, locks and corrupt data preservation</w:t>
+              <w:t xml:space="preserve">La operación sin conexión controla rechazos, interrupciones temporales, aislamiento de cuentas, bloqueos y conservación de datos dañados</w:t>
             </w:r>
           </w:p>
         </w:tc>
@@ -3655,7 +3655,7 @@
                 <w:color w:val="000000"/>
                 <w:sz w:val="19"/>
               </w:rPr>
-              <w:t>business settings reject invalid combinations and image payloads</w:t>
+              <w:t xml:space="preserve">La configuración del negocio rechaza combinaciones inválidas y datos de imagen no válidos</w:t>
             </w:r>
           </w:p>
         </w:tc>
@@ -3702,7 +3702,7 @@
                 <w:color w:val="000000"/>
                 <w:sz w:val="19"/>
               </w:rPr>
-              <w:t>tenant isolation, photo replacement/removal, idempotent sales, debt cash and overnight closing</w:t>
+              <w:t xml:space="preserve">Se comprueban el aislamiento entre negocios, el reemplazo y retiro de fotografías, las ventas idempotentes, los abonos en caja y el cierre que cruza medianoche</w:t>
             </w:r>
           </w:p>
         </w:tc>
@@ -3749,7 +3749,7 @@
                 <w:color w:val="000000"/>
                 <w:sz w:val="19"/>
               </w:rPr>
-              <w:t>replenishment suggestion targets twice the minimum stock</w:t>
+              <w:t xml:space="preserve">La sugerencia de reposición busca alcanzar el doble de las existencias mínimas</w:t>
             </w:r>
           </w:p>
         </w:tc>
@@ -3796,7 +3796,7 @@
                 <w:color w:val="000000"/>
                 <w:sz w:val="19"/>
               </w:rPr>
-              <w:t>proposal source keeps the product cost as a reference</w:t>
+              <w:t xml:space="preserve">El origen de la propuesta conserva el costo del producto como referencia</w:t>
             </w:r>
           </w:p>
         </w:tc>
@@ -3843,7 +3843,7 @@
                 <w:color w:val="000000"/>
                 <w:sz w:val="19"/>
               </w:rPr>
-              <w:t>recovered tickets use current prices and available stock</w:t>
+              <w:t xml:space="preserve">Las ventas en curso recuperadas utilizan precios vigentes y existencias disponibles</w:t>
             </w:r>
           </w:p>
         </w:tc>
@@ -3890,7 +3890,7 @@
                 <w:color w:val="000000"/>
                 <w:sz w:val="19"/>
               </w:rPr>
-              <w:t>unavailable products are removed and discount cannot exceed remaining total</w:t>
+              <w:t xml:space="preserve">Los productos no disponibles se retiran y el descuento no puede superar el total restante</w:t>
             </w:r>
           </w:p>
         </w:tc>
@@ -3937,7 +3937,7 @@
                 <w:color w:val="000000"/>
                 <w:sz w:val="19"/>
               </w:rPr>
-              <w:t>untracked stock does not reduce quantities</w:t>
+              <w:t xml:space="preserve">Los productos sin control de existencias no reducen sus cantidades</w:t>
             </w:r>
           </w:p>
         </w:tc>
@@ -3984,7 +3984,7 @@
                 <w:color w:val="000000"/>
                 <w:sz w:val="19"/>
               </w:rPr>
-              <w:t>storage roundtrip preserves distinct active and held tickets</w:t>
+              <w:t xml:space="preserve">El guardado y la recuperación conservan separadas las ventas activas y las ventas en espera</w:t>
             </w:r>
           </w:p>
         </w:tc>
@@ -4031,7 +4031,7 @@
                 <w:color w:val="000000"/>
                 <w:sz w:val="19"/>
               </w:rPr>
-              <w:t>corrupt storage is rejected instead of loading invalid quantities</w:t>
+              <w:t xml:space="preserve">El almacenamiento dañado se rechaza para evitar cargar cantidades inválidas</w:t>
             </w:r>
           </w:p>
         </w:tc>
@@ -4078,7 +4078,7 @@
                 <w:color w:val="000000"/>
                 <w:sz w:val="19"/>
               </w:rPr>
-              <w:t>storage scopes cannot collide across businesses, users or delimiters</w:t>
+              <w:t xml:space="preserve">Los espacios de almacenamiento no colisionan entre negocios, usuarios ni separadores</w:t>
             </w:r>
           </w:p>
         </w:tc>
@@ -4101,7 +4101,7 @@
     </w:p>
     <w:p>
       <w:r>
-        <w:t>Los casos se ejecutaron de forma secuencial. El negocio A comenzó con diez unidades de un producto de 1.000 CLP; el negocio B tuvo su propio producto. Después de la venta de dos unidades, el stock de A fue ocho. Repetir su clave mantuvo el mismo identificador de venta y ocho unidades. La venta fiada posterior redujo el stock a siete y generó deuda de 1.000 CLP; el abono dejó 600 CLP pendientes.</w:t>
+        <w:t xml:space="preserve">Los casos se ejecutaron de forma secuencial. El negocio A comenzó con diez unidades de un producto de 1.000 CLP; el negocio B tuvo su propio producto. Después de la venta de dos unidades, las existencias de A quedaron en ocho. Repetir su clave mantuvo el mismo identificador de venta y ocho unidades. La venta fiada posterior redujo las existencias a siete y generó deuda de 1.000 CLP; el abono dejó 600 CLP pendientes.</w:t>
       </w:r>
     </w:p>
     <w:tbl>
@@ -4263,7 +4263,7 @@
                 <w:color w:val="000000"/>
                 <w:sz w:val="19"/>
               </w:rPr>
-              <w:t>status: 401</w:t>
+              <w:t xml:space="preserve">código HTTP: 401</w:t>
             </w:r>
           </w:p>
         </w:tc>
@@ -4331,7 +4331,7 @@
                 <w:color w:val="000000"/>
                 <w:sz w:val="19"/>
               </w:rPr>
-              <w:t>message: Credenciales invalidas.</w:t>
+              <w:t xml:space="preserve">mensaje: Credenciales inválidas.</w:t>
             </w:r>
           </w:p>
         </w:tc>
@@ -4467,7 +4467,7 @@
                 <w:color w:val="000000"/>
                 <w:sz w:val="19"/>
               </w:rPr>
-              <w:t>status: 404; producto B sin cambios: sí</w:t>
+              <w:t xml:space="preserve">código HTTP: 404; producto B sin cambios: sí</w:t>
             </w:r>
           </w:p>
         </w:tc>
@@ -4535,7 +4535,7 @@
                 <w:color w:val="000000"/>
                 <w:sz w:val="19"/>
               </w:rPr>
-              <w:t>message: Tu rol no tiene permisos para realizar esta accion.</w:t>
+              <w:t xml:space="preserve">mensaje: Tu rol no tiene permisos para realizar esta acción.</w:t>
             </w:r>
           </w:p>
         </w:tc>
@@ -4582,7 +4582,7 @@
                 <w:color w:val="000000"/>
                 <w:sz w:val="19"/>
               </w:rPr>
-              <w:t>Rechazo de cantidad negativa y conservación de stock</w:t>
+              <w:t xml:space="preserve">Rechazo de cantidad negativa y conservación de existencias</w:t>
             </w:r>
           </w:p>
         </w:tc>
@@ -4603,7 +4603,7 @@
                 <w:color w:val="000000"/>
                 <w:sz w:val="19"/>
               </w:rPr>
-              <w:t>status: 400; stock: 10; ventas nuevas: 0</w:t>
+              <w:t xml:space="preserve">código HTTP: 400; existencias: 10; ventas nuevas: 0</w:t>
             </w:r>
           </w:p>
         </w:tc>
@@ -4629,7 +4629,7 @@
                 <w:color w:val="000000"/>
                 <w:sz w:val="19"/>
               </w:rPr>
-              <w:t>HTTP07 Venta y descuento de stock</w:t>
+              <w:t xml:space="preserve">HTTP07 Venta y descuento de existencias</w:t>
             </w:r>
           </w:p>
         </w:tc>
@@ -4650,7 +4650,7 @@
                 <w:color w:val="000000"/>
                 <w:sz w:val="19"/>
               </w:rPr>
-              <w:t>Venta por 2000 CLP y stock de 10 a 8</w:t>
+              <w:t xml:space="preserve">Venta por 2000 CLP y existencias de 10 a 8</w:t>
             </w:r>
           </w:p>
         </w:tc>
@@ -4671,7 +4671,7 @@
                 <w:color w:val="000000"/>
                 <w:sz w:val="19"/>
               </w:rPr>
-              <w:t>total CLP: 2000; stock final: 8</w:t>
+              <w:t xml:space="preserve">total CLP: 2000; existencias finales: 8</w:t>
             </w:r>
           </w:p>
         </w:tc>
@@ -4718,7 +4718,7 @@
                 <w:color w:val="000000"/>
                 <w:sz w:val="19"/>
               </w:rPr>
-              <w:t>Una venta y stock 8 tras repetir la misma clave</w:t>
+              <w:t xml:space="preserve">Una venta y ocho unidades disponibles tras repetir la misma clave</w:t>
             </w:r>
           </w:p>
         </w:tc>
@@ -4739,7 +4739,7 @@
                 <w:color w:val="000000"/>
                 <w:sz w:val="19"/>
               </w:rPr>
-              <w:t>misma venta: sí; ventas: 1; stock: 8</w:t>
+              <w:t xml:space="preserve">misma venta: sí; ventas: 1; existencias: 8</w:t>
             </w:r>
           </w:p>
         </w:tc>
@@ -4807,7 +4807,7 @@
                 <w:color w:val="000000"/>
                 <w:sz w:val="19"/>
               </w:rPr>
-              <w:t>deuda CLP: 1000; stock final: 7</w:t>
+              <w:t xml:space="preserve">deuda CLP: 1000; existencias finales: 7</w:t>
             </w:r>
           </w:p>
         </w:tc>
@@ -4943,7 +4943,7 @@
                 <w:color w:val="000000"/>
                 <w:sz w:val="19"/>
               </w:rPr>
-              <w:t>eventos visibles owner: 6; seller status: 403</w:t>
+              <w:t xml:space="preserve">eventos visibles para el propietario: 6; código HTTP del vendedor: 403</w:t>
             </w:r>
           </w:p>
         </w:tc>
@@ -5011,7 +5011,7 @@
                 <w:color w:val="000000"/>
                 <w:sz w:val="19"/>
               </w:rPr>
-              <w:t>sesion revocada: sí; status: 401</w:t>
+              <w:t xml:space="preserve">sesión revocada: sí; código HTTP: 401</w:t>
             </w:r>
           </w:p>
         </w:tc>
@@ -5039,7 +5039,7 @@
     </w:p>
     <w:p>
       <w:r>
-        <w:t>El primer guion esperaba HTTP 201 para el abono; el contrato implementado devuelve HTTP 200. El segundo intento quiso interpretar como JSON la respuesta vacía HTTP 204 de logout. Se corrigieron ambas expectativas del instrumento y se repitió toda la campaña. Los intentos iniciales se conservan junto a la evidencia para que el resultado final no oculte ese ajuste. No se modificó código del producto para aprobar las comprobaciones.</w:t>
+        <w:t xml:space="preserve">El primer guion esperaba HTTP 201 para el abono; el contrato implementado devuelve HTTP 200. El segundo intento quiso interpretar como JSON la respuesta vacía HTTP 204 del cierre de sesión. Se corrigieron ambas expectativas del instrumento y se repitió toda la campaña. Los intentos iniciales se conservan junto a la evidencia para que el resultado final no oculte ese ajuste. No se modificó código del producto para aprobar las comprobaciones.</w:t>
       </w:r>
     </w:p>
     <w:p>
@@ -5059,7 +5059,7 @@
     </w:p>
     <w:p>
       <w:r>
-        <w:t>Usar un clon limpio del commit indicado, Node y npm compatibles y un ambiente de prueba sin credenciales de producción. Conservar las versiones exactas del entorno. Ejecutar instalación y tipos, y luego el siguiente runner desde la raíz. La opción de importación sigue el uso documentado de tsx con Node (Node.js, s. f.; tsx, s. f.).</w:t>
+        <w:t xml:space="preserve">Usar un clon limpio de la revisión indicada, Node y npm compatibles y un ambiente de prueba sin credenciales de producción. Conservar las versiones exactas del entorno. Ejecutar instalación y tipos, y luego el siguiente ejecutor de pruebas desde la raíz. La opción de importación sigue el uso documentado de tsx con Node (Node.js, s. f.; tsx, s. f.).</w:t>
       </w:r>
     </w:p>
     <w:p>
@@ -5188,7 +5188,7 @@
     </w:p>
     <w:p>
       <w:r>
-        <w:t>La reproducción debe conservar salida completa, código de salida, commit, versiones y fecha. Si se cambia el runner, sus opciones o el servicio persistente, se registra una nueva campaña con su alcance, en lugar de reemplazar silenciosamente los resultados anteriores.</w:t>
+        <w:t xml:space="preserve">La reproducción debe conservar salida completa, código de salida, revisión, versiones y fecha. Si se cambia el ejecutor de pruebas, sus opciones o el servicio persistente, se registra una nueva campaña con su alcance, en lugar de reemplazar silenciosamente los resultados anteriores.</w:t>
       </w:r>
     </w:p>
     <w:p>
@@ -5197,13 +5197,13 @@
       </w:pPr>
       <w:bookmarkStart w:id="9" w:name="h9"/>
       <w:r>
-        <w:t>9 Evidencias  integridad y custodia</w:t>
+        <w:t xml:space="preserve">9 Evidencias integridad y custodia</w:t>
       </w:r>
       <w:bookmarkEnd w:id="9"/>
     </w:p>
     <w:p>
       <w:r>
-        <w:t>La carpeta de evidencias incluye logs, salidas, guion HTTP, resultados finales y dos intentos iniciales. El manifiesto SHA-256 permite comprobar que los archivos recibidos no cambiaron. Los registros contienen datos sintéticos y no incluyen tokens de sesión ni credenciales de comercios reales. El manifiesto del código conserva rutas y hashes de blobs de los 105 archivos recuperados, no una afirmación de haber auditado todos los archivos del repositorio.</w:t>
+        <w:t xml:space="preserve">La carpeta de evidencias incluye registros, salidas, guion HTTP, resultados finales y dos intentos iniciales. El manifiesto SHA-256 permite comprobar que los archivos recibidos no cambiaron. Los registros contienen datos sintéticos y no incluyen credenciales de sesión ni de comercios reales. El manifiesto del código conserva rutas y huellas criptográficas de los objetos de contenido de los 105 archivos recuperados, no una afirmación de haber auditado todos los archivos del repositorio.</w:t>
       </w:r>
     </w:p>
     <w:p>
@@ -5223,7 +5223,7 @@
     </w:p>
     <w:p>
       <w:r>
-        <w:t>La aceptación de las historias corresponde al equipo y al Product Owner. Este informe no cambia estados de Sprint ni demuestra éxito comercial. El Control de entrega identifica qué evidencias faltan y quién puede coordinarlas.</w:t>
+        <w:t xml:space="preserve">La aceptación de las historias corresponde al equipo y al responsable del producto. Este informe no cambia estados de las iteraciones ni demuestra éxito comercial. El Control de entrega identifica qué evidencias faltan y quién puede coordinarlas.</w:t>
       </w:r>
     </w:p>
     <w:p>
@@ -5260,25 +5260,26 @@
       <w:pPr>
         <w:keepLines/>
         <w:ind w:left="432" w:hanging="432"/>
+        <w:spacing w:after="40" w:line="240" w:lineRule="auto"/>
       </w:pPr>
       <w:r>
-        <w:t xml:space="preserve">Equipo Localito (2026). </w:t>
+        <w:t xml:space="preserve">Equipo Localito (2026). LocalitoSaaS [Código y documentación, revisión ddb9956cf35cfb2035f62528299fd6bb2c9b7d5c]. https://github.com/CamiloGonzalezSt/LocalitoSaaS/tree/ddb9956cf35cfb2035f62528299fd6bb2c9b7d5c</w:t>
       </w:r>
       <w:r>
         <w:rPr>
           <w:i/>
         </w:rPr>
-        <w:t>LocalitoSaaS [Código y documentación, commit ddb9956cf35cfb2035f62528299fd6bb2c9b7d5c]</w:t>
+        <w:t xml:space="preserve"/>
       </w:r>
       <w:r>
-        <w:t xml:space="preserve">. </w:t>
+        <w:t xml:space="preserve"/>
       </w:r>
       <w:hyperlink r:id="rId11">
         <w:r>
           <w:rPr>
             <w:color w:val="000000"/>
           </w:rPr>
-          <w:t xml:space="preserve">https://github.com/CamiloGonzalezSt/LocalitoSaaS/tree/ddb9956cf35cfb2035f62528299fd6bb2c9b7d5c</w:t>
+          <w:t xml:space="preserve"/>
         </w:r>
       </w:hyperlink>
     </w:p>
@@ -5286,25 +5287,26 @@
       <w:pPr>
         <w:keepLines/>
         <w:ind w:left="432" w:hanging="432"/>
+        <w:spacing w:after="40" w:line="240" w:lineRule="auto"/>
       </w:pPr>
       <w:r>
-        <w:t xml:space="preserve">Node.js (s. f.). </w:t>
+        <w:t xml:space="preserve">Node.js (s. f.). Ejecutor de pruebas . https://nodejs.org/api/test.html</w:t>
       </w:r>
       <w:r>
         <w:rPr>
           <w:i/>
         </w:rPr>
-        <w:t>Test runner</w:t>
+        <w:t xml:space="preserve"/>
       </w:r>
       <w:r>
-        <w:t xml:space="preserve">. </w:t>
+        <w:t xml:space="preserve"/>
       </w:r>
       <w:hyperlink r:id="rId12">
         <w:r>
           <w:rPr>
             <w:color w:val="000000"/>
           </w:rPr>
-          <w:t xml:space="preserve">https://nodejs.org/api/test.html</w:t>
+          <w:t xml:space="preserve"/>
         </w:r>
       </w:hyperlink>
     </w:p>
@@ -5312,25 +5314,26 @@
       <w:pPr>
         <w:keepLines/>
         <w:ind w:left="432" w:hanging="432"/>
+        <w:spacing w:after="40" w:line="240" w:lineRule="auto"/>
       </w:pPr>
       <w:r>
-        <w:t xml:space="preserve">tsx (s. f.). </w:t>
+        <w:t xml:space="preserve">tsx (s. f.). Interfaz de línea de comandos de Node.js . https://github.com/privatenumber/tsx/blob/master/docs/dev-api/node-cli.md</w:t>
       </w:r>
       <w:r>
         <w:rPr>
           <w:i/>
         </w:rPr>
-        <w:t>Node.js CLI</w:t>
+        <w:t xml:space="preserve"/>
       </w:r>
       <w:r>
-        <w:t xml:space="preserve">. </w:t>
+        <w:t xml:space="preserve"/>
       </w:r>
       <w:hyperlink r:id="rId13">
         <w:r>
           <w:rPr>
             <w:color w:val="000000"/>
           </w:rPr>
-          <w:t xml:space="preserve">https://github.com/privatenumber/tsx/blob/master/docs/dev-api/node-cli.md</w:t>
+          <w:t xml:space="preserve"/>
         </w:r>
       </w:hyperlink>
     </w:p>
@@ -5338,25 +5341,26 @@
       <w:pPr>
         <w:keepLines/>
         <w:ind w:left="432" w:hanging="432"/>
+        <w:spacing w:after="40" w:line="240" w:lineRule="auto"/>
       </w:pPr>
       <w:r>
-        <w:t xml:space="preserve">World Wide Web Consortium (2023). </w:t>
+        <w:t xml:space="preserve">Consorcio de la Web Mundial (W3C) (2023). Pautas de accesibilidad para el contenido web 2.2 . https://www.w3.org/TR/WCAG22/</w:t>
       </w:r>
       <w:r>
         <w:rPr>
           <w:i/>
         </w:rPr>
-        <w:t>Web Content Accessibility Guidelines 2.2</w:t>
+        <w:t xml:space="preserve"/>
       </w:r>
       <w:r>
-        <w:t xml:space="preserve">. </w:t>
+        <w:t xml:space="preserve"/>
       </w:r>
       <w:hyperlink r:id="rId14">
         <w:r>
           <w:rPr>
             <w:color w:val="000000"/>
           </w:rPr>
-          <w:t xml:space="preserve">https://www.w3.org/TR/WCAG22/</w:t>
+          <w:t xml:space="preserve"/>
         </w:r>
       </w:hyperlink>
     </w:p>
@@ -5647,7 +5651,7 @@
         <w:rFonts w:asciiTheme="minorHAnsi" w:eastAsiaTheme="minorEastAsia" w:hAnsiTheme="minorHAnsi" w:cstheme="minorBidi"/>
         <w:sz w:val="22"/>
         <w:szCs w:val="22"/>
-        <w:lang w:val="en-US" w:eastAsia="en-US" w:bidi="ar-SA"/>
+        <w:lang w:val="es-CL" w:eastAsia="en-US" w:bidi="ar-SA"/>
       </w:rPr>
     </w:rPrDefault>
     <w:pPrDefault>
@@ -17544,7 +17548,7 @@
         <w:rFonts w:asciiTheme="minorHAnsi" w:eastAsiaTheme="minorEastAsia" w:hAnsiTheme="minorHAnsi" w:cstheme="minorBidi"/>
         <w:sz w:val="22"/>
         <w:szCs w:val="22"/>
-        <w:lang w:val="en-US" w:eastAsia="en-US" w:bidi="ar-SA"/>
+        <w:lang w:val="es-CL" w:eastAsia="en-US" w:bidi="ar-SA"/>
       </w:rPr>
     </w:rPrDefault>
     <w:pPrDefault>

</xml_diff>

<commit_message>
Refuerza español en el informe de verificación
</commit_message>
<xml_diff>
--- a/entregables/evaluacion_profesor/Informe_Verificacion_Localito.docx
+++ b/entregables/evaluacion_profesor/Informe_Verificacion_Localito.docx
@@ -466,7 +466,7 @@
         <w:fldChar w:fldCharType="separate"/>
       </w:r>
       <w:r>
-        <w:t>9</w:t>
+        <w:t>11</w:t>
       </w:r>
       <w:r>
         <w:fldChar w:fldCharType="end"/>
@@ -552,7 +552,7 @@
     </w:p>
     <w:p>
       <w:r>
-        <w:t xml:space="preserve">La API de integración escuchó únicamente en 127.0.0.1:43201, con la implementación de almacenamiento en memoria MemoryRepository y negocios sintéticos. Se eliminó el proceso al finalizar. El conjunto de pruebas combina repositorio en memoria, respuestas controladas de servicios externos, un grupo simulado de conexiones a PostgreSQL y verificaciones de estilos y almacenamiento local. Ninguno de esos dobles sustituye una base PostgreSQL ni una medición de IA con imágenes reales.</w:t>
+        <w:t xml:space="preserve">La API de integración escuchó únicamente en 127.0.0.1:43201, con la implementación de almacenamiento en memoria y negocios sintéticos. Se eliminó el proceso al finalizar. El conjunto de pruebas combina repositorio en memoria, respuestas controladas de servicios externos, un grupo simulado de conexiones a PostgreSQL y verificaciones de estilos y almacenamiento local. Ninguno de esos dobles sustituye una base PostgreSQL ni una medición de IA con imágenes reales.</w:t>
       </w:r>
       <w:r>
         <w:rPr>
@@ -587,7 +587,7 @@
     </w:p>
     <w:p>
       <w:r>
-        <w:t>Los identificadores AUT corresponden al orden de los casos superiores del TAP. El archivo informa 57 casos superiores y 21 subcasos del escenario de entradas inválidas: 78 pruebas, 78 aprobadas, cero fallidas, canceladas u omitidas. El contador incluye unidades de distinto alcance y no expresa cobertura porcentual de código ni de requisitos. El resultado HTTP se presenta por separado para evitar equiparar magnitudes.</w:t>
+        <w:t xml:space="preserve">Los identificadores AUT corresponden al orden de los casos superiores del formato TAP. El archivo informa 57 casos superiores y 21 subcasos del escenario de entradas inválidas: 78 pruebas, 78 aprobadas, cero fallidas, canceladas u omitidas. El contador incluye unidades de distinto alcance y no expresa cobertura porcentual de código ni de requisitos. El resultado HTTP se presenta por separado para evitar equiparar magnitudes.</w:t>
       </w:r>
     </w:p>
     <w:p>
@@ -759,7 +759,7 @@
                 <w:color w:val="000000"/>
                 <w:sz w:val="19"/>
               </w:rPr>
-              <w:t>npm_ci.log</w:t>
+              <w:t xml:space="preserve">registro de instalación (npm_ci.log)</w:t>
             </w:r>
           </w:p>
         </w:tc>
@@ -828,7 +828,7 @@
                 <w:color w:val="000000"/>
                 <w:sz w:val="19"/>
               </w:rPr>
-              <w:t>check.log, antes del bloqueo</w:t>
+              <w:t xml:space="preserve">registro del análisis de tipos, antes del bloqueo (check.log)</w:t>
             </w:r>
           </w:p>
         </w:tc>
@@ -896,7 +896,7 @@
                 <w:color w:val="000000"/>
                 <w:sz w:val="19"/>
               </w:rPr>
-              <w:t>check.log, check.exit</w:t>
+              <w:t xml:space="preserve">registro y código de salida de la comprobación (check.log, check.exit)</w:t>
             </w:r>
           </w:p>
         </w:tc>
@@ -964,7 +964,7 @@
                 <w:color w:val="000000"/>
                 <w:sz w:val="19"/>
               </w:rPr>
-              <w:t>pruebas_verificadas.tap y .exit</w:t>
+              <w:t xml:space="preserve">registro de pruebas en formato TAP y código de salida (pruebas_verificadas.tap, .exit)</w:t>
             </w:r>
           </w:p>
         </w:tc>
@@ -1032,7 +1032,7 @@
                 <w:color w:val="000000"/>
                 <w:sz w:val="19"/>
               </w:rPr>
-              <w:t>build.log, build.exit</w:t>
+              <w:t xml:space="preserve">registro de compilación y código de salida (build.log, build.exit)</w:t>
             </w:r>
           </w:p>
         </w:tc>
@@ -1100,7 +1100,7 @@
                 <w:color w:val="000000"/>
                 <w:sz w:val="19"/>
               </w:rPr>
-              <w:t>api_resultados.json</w:t>
+              <w:t xml:space="preserve">resultados de la integración HTTP (api_resultados.json)</w:t>
             </w:r>
           </w:p>
         </w:tc>
@@ -1168,7 +1168,7 @@
                 <w:color w:val="000000"/>
                 <w:sz w:val="19"/>
               </w:rPr>
-              <w:t>browser.log, browser_install.log</w:t>
+              <w:t xml:space="preserve">registro del navegador y de su instalación (browser.log, browser_install.log)</w:t>
             </w:r>
           </w:p>
         </w:tc>
@@ -5059,7 +5059,7 @@
     </w:p>
     <w:p>
       <w:r>
-        <w:t xml:space="preserve">Usar un clon limpio de la revisión indicada, Node y npm compatibles y un ambiente de prueba sin credenciales de producción. Conservar las versiones exactas del entorno. Ejecutar instalación y tipos, y luego el siguiente ejecutor de pruebas desde la raíz. La opción de importación sigue el uso documentado de tsx con Node (Node.js, s. f.; tsx, s. f.).</w:t>
+        <w:t xml:space="preserve">Usar una copia limpia de la revisión indicada, Node y npm compatibles y un ambiente de prueba sin credenciales de producción. Conservar las versiones exactas del entorno. Ejecutar instalación y tipos, y luego el siguiente ejecutor de pruebas desde la raíz. La opción de importación sigue el uso documentado de tsx con Node (Node.js, s. f.; tsx, s. f.).</w:t>
       </w:r>
     </w:p>
     <w:p>
@@ -5244,6 +5244,7 @@
     <w:p>
       <w:pPr>
         <w:pStyle w:val="Heading1"/>
+        <w:pageBreakBefore/>
       </w:pPr>
       <w:bookmarkStart w:id="12" w:name="h12"/>
       <w:r>

</xml_diff>

<commit_message>
Traduce los nombres literales de las pruebas
</commit_message>
<xml_diff>
--- a/entregables/evaluacion_profesor/Informe_Verificacion_Localito.docx
+++ b/entregables/evaluacion_profesor/Informe_Verificacion_Localito.docx
@@ -1328,7 +1328,7 @@
     </w:p>
     <w:p>
       <w:r>
-        <w:t xml:space="preserve">Las descripciones se presentan en español. Los identificadores AUT mantienen el orden de los casos del registro de pruebas y permiten relacionar cada descripción con su evidencia. Todos los casos de esta tabla figuran aprobados. AUT45 incluye además los 21 subcasos contabilizados por Node.</w:t>
+        <w:t xml:space="preserve">Los nombres de las pruebas se presentan en español. Los identificadores AUT mantienen el orden de los casos del registro de pruebas y permiten relacionar cada nombre con su evidencia. Todos los casos de esta tabla figuran aprobados. AUT45 incluye además los 21 subcasos contabilizados por Node.</w:t>
       </w:r>
     </w:p>
     <w:tbl>
@@ -1399,7 +1399,7 @@
                 <w:color w:val="FFFFFF"/>
                 <w:sz w:val="19"/>
               </w:rPr>
-              <w:t xml:space="preserve">Descripción de la prueba</w:t>
+              <w:t xml:space="preserve">Nombre de la prueba en español</w:t>
             </w:r>
           </w:p>
         </w:tc>

</xml_diff>